<commit_message>
Extraction reviewers named (Jun Shu, Hongqiang Bian; Jun Yang adjudicates; Ji Wang checks): protocol v1.5, amendment note, workbook EX_time_log, compare_extraction script
Co-Authored-By: Claude Sonnet 5.5 <noreply@anthropic.com>
Claude-Session: https://claude.ai/code/session_01FRD7etKqYN8v2bbXeeLMRW
</commit_message>
<xml_diff>
--- a/Manuscript draft - systematic review with IPD (v0.2).docx
+++ b/Manuscript draft - systematic review with IPD (v0.2).docx
@@ -1534,15 +1534,15 @@
         <w:rPr>
           <w:rFonts w:ascii="Times New Roman" w:cs="Times New Roman" w:eastAsia="Microsoft YaHei" w:hAnsi="Times New Roman"/>
         </w:rPr>
-        <w:t xml:space="preserve">Two reviewers were to extract data independently for every included patient with a pre-specified form (Additional file 2) after calibration on 10 reports, and agreement on the primary exposure and the primary outcome was to be reported as Cohen's kappa. Where a report described patients only in aggregate, the corresponding author was to be emailed twice, four weeks apart, to request individual data; otherwise the report would be described narratively. Duplicate reports of the same patients were identified by matching institution, study period, age, sex and clinical details, and the most complete report was used. </w:t>
-      </w:r>
-      <w:r>
-        <w:rPr>
-          <w:rFonts w:ascii="Times New Roman" w:cs="Times New Roman" w:eastAsia="Microsoft YaHei" w:hAnsi="Times New Roman"/>
-          <w:b/>
-          <w:bCs/>
-        </w:rPr>
-        <w:t xml:space="preserve">[PENDING: who the two extraction reviewers are (to be named in the PROSPERO record before extraction starts), the actual extraction process, calibration result, kappa, and responses to requests.]</w:t>
+        <w:t xml:space="preserve">Two reviewers (JS and HB) were to extract data independently for every included patient with a pre-specified form (Additional file 2) after calibration on 10 reports, and agreement on the primary exposure and the primary outcome was to be reported as Cohen's kappa. Disagreements were to be settled by discussion and, failing agreement, by JY. JW, who did not extract data, was to check the two extraction files for values out of range, unit errors and duplicate patients. Where a report described patients only in aggregate, the corresponding author was to be emailed twice, four weeks apart, to request individual data; otherwise the report would be described narratively. Duplicate reports of the same patients were identified by matching institution, study period, age, sex and clinical details, and the most complete report was used. </w:t>
+      </w:r>
+      <w:r>
+        <w:rPr>
+          <w:rFonts w:ascii="Times New Roman" w:cs="Times New Roman" w:eastAsia="Microsoft YaHei" w:hAnsi="Times New Roman"/>
+          <w:b/>
+          <w:bCs/>
+        </w:rPr>
+        <w:t xml:space="preserve">[PENDING: the actual extraction process, calibration result, kappa, the result of the data checks, and responses to requests.]</w:t>
       </w:r>
     </w:p>
     <w:p>
@@ -9608,7 +9608,21 @@
         <w:rPr>
           <w:rFonts w:ascii="Times New Roman" w:cs="Times New Roman" w:eastAsia="Microsoft YaHei" w:hAnsi="Times New Roman"/>
         </w:rPr>
-        <w:t xml:space="preserve"> Evidence from case reports and small series is expected to be of very low certainty, with selective reporting of successful salvage and of favourable timelines. Embase and Google Scholar were not searched and citation searching was incomplete, so relevant reports may have been missed. Reports in languages other than English and Chinese were listed but not extracted, and reports published before 2000 were not sought, so cases described in earlier decades, including possible long histories, are not represented. The duration of symptoms is reported inconsistently and may be missing for children whose spleen was saved. Our own series is small and single-centre and includes only children who came to operation. Records excluded by both reviewers were checked only in part: the random sample of 60 contained no record advanced by the third reviewer, but 12 of the 616 records judged after the extension rule were advanced, so some eligible reports may have been missed at the title and abstract stage. Conflicts between the two reviewers were settled by a single third reviewer. Children included on the basis of splenic pedicle torsion alone, without a stated position of the spleen, may not have had a wandering spleen; one analysis omits them.</w:t>
+        <w:t xml:space="preserve"> Evidence from case reports and small series is expected to be of very low certainty, with selective reporting of successful salvage and of favourable timelines. Embase and Google Scholar were not searched and citation searching was incomplete, so relevant reports may have been missed. Reports in languages other than English and Chinese were listed but not extracted, and reports published before 2000 were not sought, so cases described in earlier decades, including possible long histories, are not represented. The duration of symptoms is reported inconsistently and may be missing for children whose spleen was saved. Our own series is small and single-centre and includes only children who came to operation. One of the two extractors (JS) took part in the pilot extraction from which the primary exposure was derived, so the extraction was not blind to the hypothesis; the pilot table was not consulted during the formal extraction </w:t>
+      </w:r>
+      <w:r>
+        <w:rPr>
+          <w:rFonts w:ascii="Times New Roman" w:cs="Times New Roman" w:eastAsia="Microsoft YaHei" w:hAnsi="Times New Roman"/>
+          <w:b/>
+          <w:bCs/>
+        </w:rPr>
+        <w:t xml:space="preserve">[PENDING: confirm at the end of the extraction]</w:t>
+      </w:r>
+      <w:r>
+        <w:rPr>
+          <w:rFonts w:ascii="Times New Roman" w:cs="Times New Roman" w:eastAsia="Microsoft YaHei" w:hAnsi="Times New Roman"/>
+        </w:rPr>
+        <w:t xml:space="preserve">. Records excluded by both reviewers were checked only in part: the random sample of 60 contained no record advanced by the third reviewer, but 12 of the 616 records judged after the extension rule were advanced, so some eligible reports may have been missed at the title and abstract stage. Conflicts between the two reviewers were settled by a single third reviewer. Children included on the basis of splenic pedicle torsion alone, without a stated position of the spleen, may not have had a wandering spleen; one analysis omits them.</w:t>
       </w:r>
     </w:p>
     <w:p>
@@ -9873,7 +9887,7 @@
           <w:b/>
           <w:bCs/>
         </w:rPr>
-        <w:t xml:space="preserve">[PENDING: to be written by the authors, referring to each author by initials, ending with "All authors read and approved the final manuscript." Contributions of FP (title and abstract stage) and HB (full-text stage) as second reviewers, and of any author added since registration, must be included.]</w:t>
+        <w:t xml:space="preserve">[PENDING: to be written by the authors, referring to each author by initials, ending with "All authors read and approved the final manuscript." Contributions of FP (title and abstract stage), HB (full-text stage and data extraction) and JW (checking of the extraction files and analysis), and of any author added since registration, must be included.]</w:t>
       </w:r>
     </w:p>
     <w:p>

</xml_diff>

<commit_message>
Ji Wang agreed to the three analysis changes; patient-level tables go to a repository, not an additional file: manuscript data statement, additional files list, amendment note, IPD e-mail draft
Co-Authored-By: Claude Sonnet 5.5 <noreply@anthropic.com>
Claude-Session: https://claude.ai/code/session_01FRD7etKqYN8v2bbXeeLMRW
</commit_message>
<xml_diff>
--- a/Manuscript draft - systematic review with IPD (v0.2).docx
+++ b/Manuscript draft - systematic review with IPD (v0.2).docx
@@ -7475,21 +7475,7 @@
         <w:rPr>
           <w:rFonts w:ascii="Times New Roman" w:cs="Times New Roman" w:eastAsia="Microsoft YaHei" w:hAnsi="Times New Roman"/>
         </w:rPr>
-        <w:t xml:space="preserve">Footnote. Boundary values fall in the lower category. Durations coded as lower bounds are listed in Additional file </w:t>
-      </w:r>
-      <w:r>
-        <w:rPr>
-          <w:rFonts w:ascii="Times New Roman" w:cs="Times New Roman" w:eastAsia="Microsoft YaHei" w:hAnsi="Times New Roman"/>
-          <w:b/>
-          <w:bCs/>
-        </w:rPr>
-        <w:t xml:space="preserve">[n]</w:t>
-      </w:r>
-      <w:r>
-        <w:rPr>
-          <w:rFonts w:ascii="Times New Roman" w:cs="Times New Roman" w:eastAsia="Microsoft YaHei" w:hAnsi="Times New Roman"/>
-        </w:rPr>
-        <w:t xml:space="preserve">.</w:t>
+        <w:t xml:space="preserve">Footnote. Boundary values fall in the lower category. Durations coded as lower bounds are flagged in the child-level dataset in the repository (see Availability of data and materials).</w:t>
       </w:r>
     </w:p>
     <w:p>
@@ -9798,15 +9784,43 @@
         <w:rPr>
           <w:rFonts w:ascii="Times New Roman" w:cs="Times New Roman" w:eastAsia="Microsoft YaHei" w:hAnsi="Times New Roman"/>
         </w:rPr>
-        <w:t xml:space="preserve"> The child-level data extracted from published reports are de-identified and are given with the source report identified </w:t>
-      </w:r>
-      <w:r>
-        <w:rPr>
-          <w:rFonts w:ascii="Times New Roman" w:cs="Times New Roman" w:eastAsia="Microsoft YaHei" w:hAnsi="Times New Roman"/>
-          <w:b/>
-          <w:bCs/>
-        </w:rPr>
-        <w:t xml:space="preserve">[PENDING: repository or additional file. The journal's additional-file rules say that no individual participant details may be included, and it is not established whether a de-identified patient-level table counts as such; ask the editorial office before deciding between a public repository and an additional file. The journal's wording for a repository is "The datasets generated and/or analysed during the current study are available in the [NAME] repository, [PERSISTENT WEB LINK TO DATASETS]"; for data inside the article and its additional files, "All data generated or analysed during this study are included in this published article [and its supplementary information files]". The journal also encourages depositing the search strings on searchRxiv and citing the dataset in the reference list with a persistent identifier.]</w:t>
+        <w:t xml:space="preserve"> The de-identified child-level data extracted from published reports, with the source report identified, are available in the </w:t>
+      </w:r>
+      <w:r>
+        <w:rPr>
+          <w:rFonts w:ascii="Times New Roman" w:cs="Times New Roman" w:eastAsia="Microsoft YaHei" w:hAnsi="Times New Roman"/>
+          <w:b/>
+          <w:bCs/>
+        </w:rPr>
+        <w:t xml:space="preserve">[PENDING: NAME]</w:t>
+      </w:r>
+      <w:r>
+        <w:rPr>
+          <w:rFonts w:ascii="Times New Roman" w:cs="Times New Roman" w:eastAsia="Microsoft YaHei" w:hAnsi="Times New Roman"/>
+        </w:rPr>
+        <w:t xml:space="preserve"> repository, </w:t>
+      </w:r>
+      <w:r>
+        <w:rPr>
+          <w:rFonts w:ascii="Times New Roman" w:cs="Times New Roman" w:eastAsia="Microsoft YaHei" w:hAnsi="Times New Roman"/>
+          <w:b/>
+          <w:bCs/>
+        </w:rPr>
+        <w:t xml:space="preserve">[PENDING: PERSISTENT WEB LINK]</w:t>
+      </w:r>
+      <w:r>
+        <w:rPr>
+          <w:rFonts w:ascii="Times New Roman" w:cs="Times New Roman" w:eastAsia="Microsoft YaHei" w:hAnsi="Times New Roman"/>
+        </w:rPr>
+        <w:t xml:space="preserve">. They are not provided as an additional file, because the journal does not allow individual participant details in additional files and a de-identified patient-level table counts as such. </w:t>
+      </w:r>
+      <w:r>
+        <w:rPr>
+          <w:rFonts w:ascii="Times New Roman" w:cs="Times New Roman" w:eastAsia="Microsoft YaHei" w:hAnsi="Times New Roman"/>
+          <w:b/>
+          <w:bCs/>
+        </w:rPr>
+        <w:t xml:space="preserve">[PENDING: check that the family-level consent for publication covers the five children's data in a public repository, and that the repository deposit is acceptable to the journal. The journal also encourages depositing the search strings on searchRxiv and citing the dataset in the reference list with a persistent identifier.]</w:t>
       </w:r>
       <w:r>
         <w:rPr>
@@ -10268,23 +10282,18 @@
         <w:rPr>
           <w:rFonts w:ascii="Times New Roman" w:cs="Times New Roman" w:eastAsia="Microsoft YaHei" w:hAnsi="Times New Roman"/>
         </w:rPr>
-        <w:t xml:space="preserve">Additional file 3: the de-identified child-level data extracted from published reports (route and format pending, see Availability of data and materials).</w:t>
-      </w:r>
-    </w:p>
-    <w:p>
-      <w:pPr>
-        <w:pStyle w:val="ListParagraph"/>
-        <w:numPr>
-          <w:ilvl w:val="0"/>
-          <w:numId w:val="2"/>
-        </w:numPr>
-        <w:spacing w:after="60" w:line="480" w:lineRule="auto"/>
-      </w:pPr>
-      <w:r>
-        <w:rPr>
-          <w:rFonts w:ascii="Times New Roman" w:cs="Times New Roman" w:eastAsia="Microsoft YaHei" w:hAnsi="Times New Roman"/>
-        </w:rPr>
-        <w:t xml:space="preserve">Additional file 4 (format to be decided): PRISMA 2020 and PRISMA-IPD checklists.</w:t>
+        <w:t xml:space="preserve">Additional file 3 (format to be decided): PRISMA 2020 and PRISMA-IPD checklists.</w:t>
+      </w:r>
+    </w:p>
+    <w:p>
+      <w:pPr>
+        <w:spacing w:after="120" w:line="480" w:lineRule="auto"/>
+      </w:pPr>
+      <w:r>
+        <w:rPr>
+          <w:rFonts w:ascii="Times New Roman" w:cs="Times New Roman" w:eastAsia="Microsoft YaHei" w:hAnsi="Times New Roman"/>
+        </w:rPr>
+        <w:t xml:space="preserve">The child-level data are not an additional file; they are deposited in a repository (see Availability of data and materials).</w:t>
       </w:r>
     </w:p>
     <w:sectPr>

</xml_diff>

<commit_message>
Log: PROSPERO version 2.0 published; manuscript draft states the amendment date
Co-Authored-By: Claude Sonnet 5.5 <noreply@anthropic.com>
Claude-Session: https://claude.ai/code/session_01FRD7etKqYN8v2bbXeeLMRW
</commit_message>
<xml_diff>
--- a/Manuscript draft - systematic review with IPD (v0.2).docx
+++ b/Manuscript draft - systematic review with IPD (v0.2).docx
@@ -403,15 +403,15 @@
         <w:rPr>
           <w:rFonts w:ascii="Times New Roman" w:cs="Times New Roman" w:eastAsia="Microsoft YaHei" w:hAnsi="Times New Roman"/>
         </w:rPr>
-        <w:t xml:space="preserve">The protocol was registered in PROSPERO on 28 September 2026 (CRD420261520329). The protocol document was then revised in versions 1.1 to 1.5: version 1.1 revised the search strategies after review by a medical librarian, before any formal search was run; version 1.2 added the as-run details of the searches and the deviations listed below; versions 1.3 and 1.4 added the screening procedure and the stage of the review; version 1.5 describes how the title and abstract stage was carried out and sets out the full-text procedure. Eligibility criteria, exposures, outcomes and the analysis plan were not changed in versions 1.1 to 1.4. Version 1.5 changed them only in the respects listed under Deviations from the protocol: reports published before 2000 are not sought, which empties one level of the period-of-publication covariate and makes one registered sensitivity analysis inapplicable, and one analysis that was not registered was added. The review question, the primary exposure and the primary outcome are unchanged. </w:t>
-      </w:r>
-      <w:r>
-        <w:rPr>
-          <w:rFonts w:ascii="Times New Roman" w:cs="Times New Roman" w:eastAsia="Microsoft YaHei" w:hAnsi="Times New Roman"/>
-          <w:b/>
-          <w:bCs/>
-        </w:rPr>
-        <w:t xml:space="preserve">[PENDING: the PROSPERO record itself has not yet been amended; give the date of the amendment once it has been submitted.]</w:t>
+        <w:t xml:space="preserve">The protocol was registered in PROSPERO on 28 September 2026 (CRD420261520329). The protocol document was then revised in versions 1.1 to 1.5: version 1.1 revised the search strategies after review by a medical librarian, before any formal search was run; version 1.2 added the as-run details of the searches and the deviations listed below; versions 1.3 and 1.4 added the screening procedure and the stage of the review; version 1.5 describes how the title and abstract stage was carried out and sets out the full-text procedure. Eligibility criteria, exposures, outcomes and the analysis plan were not changed in versions 1.1 to 1.4. Version 1.5 changed them only in the respects listed under Deviations from the protocol: reports published before 2000 are not sought, which empties one level of the period-of-publication covariate and makes one registered sensitivity analysis inapplicable, and one analysis that was not registered was added. The review question, the primary exposure and the primary outcome are unchanged. The PROSPERO record was amended once, on 18 October 2026 (record version 2.0, published at 15:20 UTC after approval by the review team); it reports the searches as run, the screening procedure as carried out and the changes listed under Deviations from the protocol. </w:t>
+      </w:r>
+      <w:r>
+        <w:rPr>
+          <w:rFonts w:ascii="Times New Roman" w:cs="Times New Roman" w:eastAsia="Microsoft YaHei" w:hAnsi="Times New Roman"/>
+          <w:b/>
+          <w:bCs/>
+        </w:rPr>
+        <w:t xml:space="preserve">[PENDING: confirm that the protocol file attached to the record is version 1.5 and whether it is publicly visible.]</w:t>
       </w:r>
       <w:r>
         <w:rPr>

</xml_diff>

<commit_message>
Log: protocol file on the published PROSPERO record is v1.5 and public; manuscript draft updated
Co-Authored-By: Claude Sonnet 5.5 <noreply@anthropic.com>
Claude-Session: https://claude.ai/code/session_01FRD7etKqYN8v2bbXeeLMRW
</commit_message>
<xml_diff>
--- a/Manuscript draft - systematic review with IPD (v0.2).docx
+++ b/Manuscript draft - systematic review with IPD (v0.2).docx
@@ -403,21 +403,7 @@
         <w:rPr>
           <w:rFonts w:ascii="Times New Roman" w:cs="Times New Roman" w:eastAsia="Microsoft YaHei" w:hAnsi="Times New Roman"/>
         </w:rPr>
-        <w:t xml:space="preserve">The protocol was registered in PROSPERO on 28 September 2026 (CRD420261520329). The protocol document was then revised in versions 1.1 to 1.5: version 1.1 revised the search strategies after review by a medical librarian, before any formal search was run; version 1.2 added the as-run details of the searches and the deviations listed below; versions 1.3 and 1.4 added the screening procedure and the stage of the review; version 1.5 describes how the title and abstract stage was carried out and sets out the full-text procedure. Eligibility criteria, exposures, outcomes and the analysis plan were not changed in versions 1.1 to 1.4. Version 1.5 changed them only in the respects listed under Deviations from the protocol: reports published before 2000 are not sought, which empties one level of the period-of-publication covariate and makes one registered sensitivity analysis inapplicable, and one analysis that was not registered was added. The review question, the primary exposure and the primary outcome are unchanged. The PROSPERO record was amended once, on 18 October 2026 (record version 2.0, published at 15:20 UTC after approval by the review team); it reports the searches as run, the screening procedure as carried out and the changes listed under Deviations from the protocol. </w:t>
-      </w:r>
-      <w:r>
-        <w:rPr>
-          <w:rFonts w:ascii="Times New Roman" w:cs="Times New Roman" w:eastAsia="Microsoft YaHei" w:hAnsi="Times New Roman"/>
-          <w:b/>
-          <w:bCs/>
-        </w:rPr>
-        <w:t xml:space="preserve">[PENDING: confirm that the protocol file attached to the record is version 1.5 and whether it is publicly visible.]</w:t>
-      </w:r>
-      <w:r>
-        <w:rPr>
-          <w:rFonts w:ascii="Times New Roman" w:cs="Times New Roman" w:eastAsia="Microsoft YaHei" w:hAnsi="Times New Roman"/>
-        </w:rPr>
-        <w:t xml:space="preserve"> The review is reported according to PRISMA 2020 [10], PRISMA-IPD [11] and, for the searches, PRISMA-S [12].</w:t>
+        <w:t xml:space="preserve">The protocol was registered in PROSPERO on 28 September 2026 (CRD420261520329). The protocol document was then revised in versions 1.1 to 1.5: version 1.1 revised the search strategies after review by a medical librarian, before any formal search was run; version 1.2 added the as-run details of the searches and the deviations listed below; versions 1.3 and 1.4 added the screening procedure and the stage of the review; version 1.5 describes how the title and abstract stage was carried out and sets out the full-text procedure. Eligibility criteria, exposures, outcomes and the analysis plan were not changed in versions 1.1 to 1.4. Version 1.5 changed them only in the respects listed under Deviations from the protocol: reports published before 2000 are not sought, which empties one level of the period-of-publication covariate and makes one registered sensitivity analysis inapplicable, and one analysis that was not registered was added. The review question, the primary exposure and the primary outcome are unchanged. The PROSPERO record was amended once, on 18 October 2026 (record version 2.0, published at 15:20 UTC after approval by the review team); it reports the searches as run, the screening procedure as carried out and the changes listed under Deviations from the protocol. The protocol file attached to the record is version 1.5 and is publicly available through the record. The review is reported according to PRISMA 2020 [10], PRISMA-IPD [11] and, for the searches, PRISMA-S [12].</w:t>
       </w:r>
     </w:p>
     <w:p>

</xml_diff>

<commit_message>
Protocol v1.7 and manuscript: viability recording rule and three added analyses
Ji Wang's answers (relayed by the author) on missing outcome, lower-bound
durations and possible duplicate patients written into the protocol
(Sections 14, 16, 18, Appendix C) and the manuscript draft Methods,
Results templates, Table 6, Deviations and Limitations. Decided after the
10-report extraction calibration and before formal extraction. Not uploaded
to PROSPERO.

Co-Authored-By: Claude Sonnet 5.5 <noreply@anthropic.com>
Claude-Session: https://claude.ai/code/session_01FRD7etKqYN8v2bbXeeLMRW
</commit_message>
<xml_diff>
--- a/Manuscript draft - systematic review with IPD (v0.2).docx
+++ b/Manuscript draft - systematic review with IPD (v0.2).docx
@@ -403,15 +403,15 @@
         <w:rPr>
           <w:rFonts w:ascii="Times New Roman" w:cs="Times New Roman" w:eastAsia="Microsoft YaHei" w:hAnsi="Times New Roman"/>
         </w:rPr>
-        <w:t xml:space="preserve">The protocol was registered in PROSPERO on 28 September 2026 (CRD420261520329). The protocol document was then revised in versions 1.1 to 1.6: version 1.1 revised the search strategies after review by a medical librarian, before any formal search was run; version 1.2 added the as-run details of the searches and the deviations listed below; versions 1.3 and 1.4 added the screening procedure and the stage of the review; version 1.5 describes how the title and abstract stage was carried out and sets out the full-text procedure; version 1.6 drops the log of working times for the full-text stage. Eligibility criteria, exposures, outcomes and the analysis plan were not changed in versions 1.1 to 1.4 or in version 1.6. Version 1.5 changed them only in the respects listed under Deviations from the protocol: reports published before 2000 are not sought, which empties one level of the period-of-publication covariate and makes one registered sensitivity analysis inapplicable, and one analysis that was not registered was added. The review question, the primary exposure and the primary outcome are unchanged. The PROSPERO record was amended once, on 18 October 2026 (record version 2.0, published at 15:20 UTC after approval by the review team); it reports the searches as run, the screening procedure as carried out and the changes listed under Deviations from the protocol. The protocol file attached to the record is version 1.5 and is publicly available through the record. </w:t>
-      </w:r>
-      <w:r>
-        <w:rPr>
-          <w:rFonts w:ascii="Times New Roman" w:cs="Times New Roman" w:eastAsia="Microsoft YaHei" w:hAnsi="Times New Roman"/>
-          <w:b/>
-          <w:bCs/>
-        </w:rPr>
-        <w:t xml:space="preserve">[PENDING: version 1.6 (19 October 2026), which only drops the log of working times, is not attached to the record. The authors to decide whether to replace the file (according to the record page as read on 18 October 2026, the protocol file can be changed without the approval of the other authors) or to rely on the Deviations section; either way the Deviations section must say which version is attached.]</w:t>
+        <w:t xml:space="preserve">The protocol was registered in PROSPERO on 28 September 2026 (CRD420261520329). The protocol document was then revised in versions 1.1 to 1.7: version 1.1 revised the search strategies after review by a medical librarian, before any formal search was run; version 1.2 added the as-run details of the searches and the deviations listed below; versions 1.3 and 1.4 added the screening procedure and the stage of the review; version 1.5 describes how the title and abstract stage was carried out and sets out the full-text procedure; version 1.6 drops the log of working times for the full-text stage; version 1.7 specifies how splenic viability is recorded and how a missing outcome, durations that are only lower bounds and possible duplicate patients are handled in the analysis. Eligibility criteria, exposures, outcomes and the analysis plan were not changed in versions 1.1 to 1.4 or in version 1.6. Version 1.5 changed them only in the respects listed under Deviations from the protocol: reports published before 2000 are not sought, which empties one level of the period-of-publication covariate and makes one registered sensitivity analysis inapplicable, and one analysis that was not registered was added. Version 1.7 added a rule for recording splenic viability and three further analyses that were not registered; it was dated 25 October 2026, after the extraction form had been calibrated on 10 reports and before the formal extraction began, and before any analysis of duration and outcome. The review question, the primary exposure and the primary outcome are unchanged. The PROSPERO record was amended once, on 18 October 2026 (record version 2.0, published at 15:20 UTC after approval by the review team); it reports the searches as run, the screening procedure as carried out and the changes listed under Deviations from the protocol. The protocol file attached to the record is version 1.5 and is publicly available through the record. </w:t>
+      </w:r>
+      <w:r>
+        <w:rPr>
+          <w:rFonts w:ascii="Times New Roman" w:cs="Times New Roman" w:eastAsia="Microsoft YaHei" w:hAnsi="Times New Roman"/>
+          <w:b/>
+          <w:bCs/>
+        </w:rPr>
+        <w:t xml:space="preserve">[PENDING: versions 1.6 (19 October 2026), which only drops the log of working times, and 1.7 (25 October 2026) are not attached to the record, and the registered text of the data synthesis does not contain the version 1.7 analyses (a change to that field needs a major revision approved by all authors). The authors to decide whether to replace the file (according to the record page as read on 18 October 2026, the protocol file can be changed without the approval of the other authors) or to rely on the Deviations section; either way the Deviations section must say which version is attached.]</w:t>
       </w:r>
       <w:r>
         <w:rPr>
@@ -1534,7 +1534,7 @@
         <w:rPr>
           <w:rFonts w:ascii="Times New Roman" w:cs="Times New Roman" w:eastAsia="Microsoft YaHei" w:hAnsi="Times New Roman"/>
         </w:rPr>
-        <w:t xml:space="preserve">Two reviewers (JS and HB) were to extract data independently for every included patient with a pre-specified form (Additional file 2) after calibration on 10 reports, and agreement on the primary exposure and the primary outcome was to be reported as Cohen's kappa. Disagreements were to be settled by discussion and, failing agreement, by JY. JW, who did not extract data, was to check the two extraction files for values out of range, unit errors and duplicate patients. Where a report described patients only in aggregate, the corresponding author was to be emailed twice, four weeks apart, to request individual data; otherwise the report would be described narratively. Duplicate reports of the same patients were identified by matching institution, study period, age, sex and clinical details, and the most complete report was used. </w:t>
+        <w:t xml:space="preserve">Two reviewers (JS and HB) were to extract data independently for every included patient with a pre-specified form (Additional file 2) after calibration on 10 reports, and agreement on the primary exposure and the primary outcome was to be reported as Cohen's kappa. Disagreements were to be settled by discussion and, failing agreement, by JY. JW, who did not extract data, was to check the two extraction files for values out of range, unit errors and duplicate patients. Where a report described patients only in aggregate, the corresponding author was to be emailed twice, four weeks apart, to request individual data; otherwise the report would be described narratively. Duplicate reports of the same patients were identified by matching institution, study period, age, sex and clinical details, and the most complete report was used. Where a report stated that some of its patients had been reported before without saying which, the possible overlap was recorded at the level of the report and no patient was linked. </w:t>
       </w:r>
       <w:r>
         <w:rPr>
@@ -1624,7 +1624,7 @@
         <w:rPr>
           <w:rFonts w:ascii="Times New Roman" w:cs="Times New Roman" w:eastAsia="Microsoft YaHei" w:hAnsi="Times New Roman"/>
         </w:rPr>
-        <w:t xml:space="preserve"> was a non-viable spleen at the index operation: total or partial splenectomy performed because of infarction, necrosis or failure to reperfuse after detorsion, as judged at operation or on histology. A viable spleen removed for another reason counted as viable for this outcome. </w:t>
+        <w:t xml:space="preserve"> was a non-viable spleen at the index operation: total or partial splenectomy performed because of infarction, necrosis or failure to reperfuse after detorsion, as judged at operation or on histology. Viability was recorded only where the authors described the state of the spleen at operation or on histology; it was not inferred from the operation performed or from imaging, and was otherwise recorded as not reported. A viable spleen removed for another reason counted as viable for this outcome. </w:t>
       </w:r>
       <w:r>
         <w:rPr>
@@ -1711,15 +1711,15 @@
         <w:rPr>
           <w:rFonts w:ascii="Times New Roman" w:cs="Times New Roman" w:eastAsia="Microsoft YaHei" w:hAnsi="Times New Roman"/>
         </w:rPr>
-        <w:t xml:space="preserve">Missing durations were handled by complete-case analysis, a comparison of patients with and without a reported duration, and bounding analyses that assigned all missing durations first to the shortest and then to the longest category; multiple imputation was not used because duration is unlikely to be missing at random. Pre-specified subgroups were presentation with gastric volvulus or gastric outlet obstruction, congenital versus acquired wandering spleen, and an associated diaphragmatic anomaly. Pre-specified sensitivity analyses excluded our own five patients, restricted the analysis to pedicle torsion confirmed at operation, coded partial splenectomy for partial infarction as salvage, used alternative coding of intermittent or worsening episodes, restricted the analysis to reports judged adequate, excluded Chinese-language reports, and used mixed-effects logistic regression with a random intercept for each report; the registered analysis that excluded reports published before 2000 does not apply, because such reports were not sought. One analysis that was not registered was added: omission of children who were included on the basis of splenic pedicle torsion alone, without a stated position of the spleen. </w:t>
-      </w:r>
-      <w:r>
-        <w:rPr>
-          <w:rFonts w:ascii="Times New Roman" w:cs="Times New Roman" w:eastAsia="Microsoft YaHei" w:hAnsi="Times New Roman"/>
-          <w:b/>
-          <w:bCs/>
-        </w:rPr>
-        <w:t xml:space="preserve">[PENDING: confirm the added analysis with the statistician.]</w:t>
+        <w:t xml:space="preserve">Missing durations were handled by complete-case analysis, a comparison of patients with and without a reported duration, and bounding analyses that assigned all missing durations first to the shortest and then to the longest category; multiple imputation was not used because duration is unlikely to be missing at random. Children whose splenic viability was not reported were not in the primary analysis; their number and the operations they had are reported. Pre-specified subgroups were presentation with gastric volvulus or gastric outlet obstruction, congenital versus acquired wandering spleen, and an associated diaphragmatic anomaly. Pre-specified sensitivity analyses excluded our own five patients, restricted the analysis to pedicle torsion confirmed at operation, coded partial splenectomy for partial infarction as salvage, used alternative coding of intermittent or worsening episodes, restricted the analysis to reports judged adequate, excluded Chinese-language reports, and used mixed-effects logistic regression with a random intercept for each report; the registered analysis that excluded reports published before 2000 does not apply, because such reports were not sought. Four analyses that were not registered were added. The first, in version 1.5, omitted children who were included on the basis of splenic pedicle torsion alone, without a stated position of the spleen. The other three were added in version 1.7, before the formal extraction began: (a) children who had a splenectomy and whose viability was not reported were assigned first all to non-viable and then all to viable, because viability may be omitted more often in children whose spleen was removed; the assignment to non-viable is an assumption, not an observation; (b) children whose index-episode duration was only a lower bound, that is, the report gave the duration up to consultation or admission but not the time to operation (rule 9), were omitted; and (c) where a report stated that some of its patients had been reported before without saying which, the report that stated the overlap was omitted, because the overlapping children could not be identified and cluster-robust standard errors do not remove duplicated patients. </w:t>
+      </w:r>
+      <w:r>
+        <w:rPr>
+          <w:rFonts w:ascii="Times New Roman" w:cs="Times New Roman" w:eastAsia="Microsoft YaHei" w:hAnsi="Times New Roman"/>
+          <w:b/>
+          <w:bCs/>
+        </w:rPr>
+        <w:t xml:space="preserve">[PENDING: confirm with the statistician the added analyses and, for (c), which of the two reports is omitted; how our own five children are clustered and which period they take; how durations that are not whole days are assigned to the four categories.]</w:t>
       </w:r>
       <w:r>
         <w:rPr>
@@ -1979,6 +1979,22 @@
           <w:rFonts w:ascii="Times New Roman" w:cs="Times New Roman" w:eastAsia="Microsoft YaHei" w:hAnsi="Times New Roman"/>
         </w:rPr>
         <w:t xml:space="preserve">Full-text decisions were kept in spreadsheet logs, not in Rayyan, which was used for the title and abstract stage.</w:t>
+      </w:r>
+    </w:p>
+    <w:p>
+      <w:pPr>
+        <w:pStyle w:val="ListParagraph"/>
+        <w:numPr>
+          <w:ilvl w:val="0"/>
+          <w:numId w:val="2"/>
+        </w:numPr>
+        <w:spacing w:after="60" w:line="480" w:lineRule="auto"/>
+      </w:pPr>
+      <w:r>
+        <w:rPr>
+          <w:rFonts w:ascii="Times New Roman" w:cs="Times New Roman" w:eastAsia="Microsoft YaHei" w:hAnsi="Times New Roman"/>
+        </w:rPr>
+        <w:t xml:space="preserve">Protocol version 1.7 (25 October 2026), decided after the calibration of the extraction form and before the formal extraction began, added a rule that splenic viability is recorded only where the authors describe the spleen, and three analyses that were not registered: assignment of children who had a splenectomy and whose viability was not reported first to non-viable and then to viable; omission of children whose duration is only a lower bound; and omission of the report that states an overlap with another report. They were added because the calibration showed that many children would have no recorded viability, that many durations were lower bounds, and that two reports probably share children. The registered record (version 2.0) does not contain them.</w:t>
       </w:r>
     </w:p>
     <w:p>
@@ -6552,7 +6568,63 @@
         <w:rPr>
           <w:rFonts w:ascii="Times New Roman" w:cs="Times New Roman" w:eastAsia="Microsoft YaHei" w:hAnsi="Times New Roman"/>
         </w:rPr>
-        <w:t xml:space="preserve">.</w:t>
+        <w:t xml:space="preserve">. Splenic viability was not reported for </w:t>
+      </w:r>
+      <w:r>
+        <w:rPr>
+          <w:rFonts w:ascii="Times New Roman" w:cs="Times New Roman" w:eastAsia="Microsoft YaHei" w:hAnsi="Times New Roman"/>
+          <w:b/>
+          <w:bCs/>
+        </w:rPr>
+        <w:t xml:space="preserve">[n]</w:t>
+      </w:r>
+      <w:r>
+        <w:rPr>
+          <w:rFonts w:ascii="Times New Roman" w:cs="Times New Roman" w:eastAsia="Microsoft YaHei" w:hAnsi="Times New Roman"/>
+        </w:rPr>
+        <w:t xml:space="preserve"> children, who were not in the primary analysis; </w:t>
+      </w:r>
+      <w:r>
+        <w:rPr>
+          <w:rFonts w:ascii="Times New Roman" w:cs="Times New Roman" w:eastAsia="Microsoft YaHei" w:hAnsi="Times New Roman"/>
+          <w:b/>
+          <w:bCs/>
+        </w:rPr>
+        <w:t xml:space="preserve">[n]</w:t>
+      </w:r>
+      <w:r>
+        <w:rPr>
+          <w:rFonts w:ascii="Times New Roman" w:cs="Times New Roman" w:eastAsia="Microsoft YaHei" w:hAnsi="Times New Roman"/>
+        </w:rPr>
+        <w:t xml:space="preserve"> of them had a splenectomy and </w:t>
+      </w:r>
+      <w:r>
+        <w:rPr>
+          <w:rFonts w:ascii="Times New Roman" w:cs="Times New Roman" w:eastAsia="Microsoft YaHei" w:hAnsi="Times New Roman"/>
+          <w:b/>
+          <w:bCs/>
+        </w:rPr>
+        <w:t xml:space="preserve">[n]</w:t>
+      </w:r>
+      <w:r>
+        <w:rPr>
+          <w:rFonts w:ascii="Times New Roman" w:cs="Times New Roman" w:eastAsia="Microsoft YaHei" w:hAnsi="Times New Roman"/>
+        </w:rPr>
+        <w:t xml:space="preserve"> had another operation or none. For </w:t>
+      </w:r>
+      <w:r>
+        <w:rPr>
+          <w:rFonts w:ascii="Times New Roman" w:cs="Times New Roman" w:eastAsia="Microsoft YaHei" w:hAnsi="Times New Roman"/>
+          <w:b/>
+          <w:bCs/>
+        </w:rPr>
+        <w:t xml:space="preserve">[n]</w:t>
+      </w:r>
+      <w:r>
+        <w:rPr>
+          <w:rFonts w:ascii="Times New Roman" w:cs="Times New Roman" w:eastAsia="Microsoft YaHei" w:hAnsi="Times New Roman"/>
+        </w:rPr>
+        <w:t xml:space="preserve"> children the duration was a lower bound.</w:t>
       </w:r>
     </w:p>
     <w:p>
@@ -6759,7 +6831,91 @@
         <w:rPr>
           <w:rFonts w:ascii="Times New Roman" w:cs="Times New Roman" w:eastAsia="Microsoft YaHei" w:hAnsi="Times New Roman"/>
         </w:rPr>
-        <w:t xml:space="preserve">.</w:t>
+        <w:t xml:space="preserve">. When the children who had a splenectomy and whose viability was not reported were all assigned to a non-viable spleen the odds ratio was </w:t>
+      </w:r>
+      <w:r>
+        <w:rPr>
+          <w:rFonts w:ascii="Times New Roman" w:cs="Times New Roman" w:eastAsia="Microsoft YaHei" w:hAnsi="Times New Roman"/>
+          <w:b/>
+          <w:bCs/>
+        </w:rPr>
+        <w:t xml:space="preserve">[x]</w:t>
+      </w:r>
+      <w:r>
+        <w:rPr>
+          <w:rFonts w:ascii="Times New Roman" w:cs="Times New Roman" w:eastAsia="Microsoft YaHei" w:hAnsi="Times New Roman"/>
+        </w:rPr>
+        <w:t xml:space="preserve"> (</w:t>
+      </w:r>
+      <w:r>
+        <w:rPr>
+          <w:rFonts w:ascii="Times New Roman" w:cs="Times New Roman" w:eastAsia="Microsoft YaHei" w:hAnsi="Times New Roman"/>
+          <w:b/>
+          <w:bCs/>
+        </w:rPr>
+        <w:t xml:space="preserve">[x]</w:t>
+      </w:r>
+      <w:r>
+        <w:rPr>
+          <w:rFonts w:ascii="Times New Roman" w:cs="Times New Roman" w:eastAsia="Microsoft YaHei" w:hAnsi="Times New Roman"/>
+        </w:rPr>
+        <w:t xml:space="preserve"> to </w:t>
+      </w:r>
+      <w:r>
+        <w:rPr>
+          <w:rFonts w:ascii="Times New Roman" w:cs="Times New Roman" w:eastAsia="Microsoft YaHei" w:hAnsi="Times New Roman"/>
+          <w:b/>
+          <w:bCs/>
+        </w:rPr>
+        <w:t xml:space="preserve">[x]</w:t>
+      </w:r>
+      <w:r>
+        <w:rPr>
+          <w:rFonts w:ascii="Times New Roman" w:cs="Times New Roman" w:eastAsia="Microsoft YaHei" w:hAnsi="Times New Roman"/>
+        </w:rPr>
+        <w:t xml:space="preserve">), and when they were all assigned to a viable spleen it was </w:t>
+      </w:r>
+      <w:r>
+        <w:rPr>
+          <w:rFonts w:ascii="Times New Roman" w:cs="Times New Roman" w:eastAsia="Microsoft YaHei" w:hAnsi="Times New Roman"/>
+          <w:b/>
+          <w:bCs/>
+        </w:rPr>
+        <w:t xml:space="preserve">[x]</w:t>
+      </w:r>
+      <w:r>
+        <w:rPr>
+          <w:rFonts w:ascii="Times New Roman" w:cs="Times New Roman" w:eastAsia="Microsoft YaHei" w:hAnsi="Times New Roman"/>
+        </w:rPr>
+        <w:t xml:space="preserve"> (</w:t>
+      </w:r>
+      <w:r>
+        <w:rPr>
+          <w:rFonts w:ascii="Times New Roman" w:cs="Times New Roman" w:eastAsia="Microsoft YaHei" w:hAnsi="Times New Roman"/>
+          <w:b/>
+          <w:bCs/>
+        </w:rPr>
+        <w:t xml:space="preserve">[x]</w:t>
+      </w:r>
+      <w:r>
+        <w:rPr>
+          <w:rFonts w:ascii="Times New Roman" w:cs="Times New Roman" w:eastAsia="Microsoft YaHei" w:hAnsi="Times New Roman"/>
+        </w:rPr>
+        <w:t xml:space="preserve"> to </w:t>
+      </w:r>
+      <w:r>
+        <w:rPr>
+          <w:rFonts w:ascii="Times New Roman" w:cs="Times New Roman" w:eastAsia="Microsoft YaHei" w:hAnsi="Times New Roman"/>
+          <w:b/>
+          <w:bCs/>
+        </w:rPr>
+        <w:t xml:space="preserve">[x]</w:t>
+      </w:r>
+      <w:r>
+        <w:rPr>
+          <w:rFonts w:ascii="Times New Roman" w:cs="Times New Roman" w:eastAsia="Microsoft YaHei" w:hAnsi="Times New Roman"/>
+        </w:rPr>
+        <w:t xml:space="preserve">); the first of these rests on an assumption, not an observation.</w:t>
       </w:r>
     </w:p>
     <w:p>
@@ -7864,7 +8020,7 @@
         <w:rPr>
           <w:rFonts w:ascii="Times New Roman" w:cs="Times New Roman" w:eastAsia="Microsoft YaHei" w:hAnsi="Times New Roman"/>
         </w:rPr>
-        <w:t xml:space="preserve"> children). Of the eight registered sensitivity analyses, seven could be done (omitting the institutional series; pedicle torsion confirmed at operation only; partial splenectomy for partial infarction coded as salvage; alternative coding of intermittent or worsening episodes; reports judged adequate only; omitting Chinese-language reports; mixed-effects model with a random intercept for each report), and the eighth, omitting reports before 2000, did not apply. An analysis added after registration, omitting children included because of pedicle torsion alone, was also done. The odds ratios ranged from </w:t>
+        <w:t xml:space="preserve"> children). Of the eight registered sensitivity analyses, seven could be done (omitting the institutional series; pedicle torsion confirmed at operation only; partial splenectomy for partial infarction coded as salvage; alternative coding of intermittent or worsening episodes; reports judged adequate only; omitting Chinese-language reports; mixed-effects model with a random intercept for each report), and the eighth, omitting reports before 2000, did not apply. Four analyses added after registration were also done: omitting children included because of pedicle torsion alone; assigning children who had a splenectomy and whose viability was not reported first to non-viable and then to viable; omitting children whose duration was only a lower bound; and omitting the report that stated an overlap with another report. The odds ratios ranged from </w:t>
       </w:r>
       <w:r>
         <w:rPr>
@@ -9099,6 +9255,462 @@
             <w:tcBorders>
               <w:top w:val="none" w:color="FFFFFF" w:sz="0"/>
               <w:left w:val="none" w:color="FFFFFF" w:sz="0"/>
+              <w:bottom w:val="none" w:color="FFFFFF" w:sz="0"/>
+              <w:right w:val="none" w:color="FFFFFF" w:sz="0"/>
+            </w:tcBorders>
+            <w:tcMar>
+              <w:top w:type="dxa" w:w="60"/>
+              <w:left w:type="dxa" w:w="100"/>
+              <w:bottom w:type="dxa" w:w="60"/>
+              <w:right w:type="dxa" w:w="100"/>
+            </w:tcMar>
+          </w:tcPr>
+          <w:p>
+            <w:r>
+              <w:rPr>
+                <w:rFonts w:ascii="Times New Roman" w:cs="Times New Roman" w:eastAsia="Microsoft YaHei" w:hAnsi="Times New Roman"/>
+                <w:sz w:val="20"/>
+                <w:szCs w:val="20"/>
+              </w:rPr>
+              <w:t xml:space="preserve">9. Without children included on the basis of pedicle torsion alone (added after registration)</w:t>
+            </w:r>
+          </w:p>
+        </w:tc>
+        <w:tc>
+          <w:tcPr>
+            <w:tcW w:type="dxa" w:w="2256"/>
+            <w:tcBorders>
+              <w:top w:val="none" w:color="FFFFFF" w:sz="0"/>
+              <w:left w:val="none" w:color="FFFFFF" w:sz="0"/>
+              <w:bottom w:val="none" w:color="FFFFFF" w:sz="0"/>
+              <w:right w:val="none" w:color="FFFFFF" w:sz="0"/>
+            </w:tcBorders>
+            <w:tcMar>
+              <w:top w:type="dxa" w:w="60"/>
+              <w:left w:type="dxa" w:w="100"/>
+              <w:bottom w:type="dxa" w:w="60"/>
+              <w:right w:type="dxa" w:w="100"/>
+            </w:tcMar>
+          </w:tcPr>
+          <w:p>
+            <w:r>
+              <w:rPr>
+                <w:rFonts w:ascii="Times New Roman" w:cs="Times New Roman" w:eastAsia="Microsoft YaHei" w:hAnsi="Times New Roman"/>
+                <w:sz w:val="20"/>
+                <w:szCs w:val="20"/>
+              </w:rPr>
+              <w:t xml:space="preserve">[n]</w:t>
+            </w:r>
+          </w:p>
+        </w:tc>
+        <w:tc>
+          <w:tcPr>
+            <w:tcW w:type="dxa" w:w="2256"/>
+            <w:tcBorders>
+              <w:top w:val="none" w:color="FFFFFF" w:sz="0"/>
+              <w:left w:val="none" w:color="FFFFFF" w:sz="0"/>
+              <w:bottom w:val="none" w:color="FFFFFF" w:sz="0"/>
+              <w:right w:val="none" w:color="FFFFFF" w:sz="0"/>
+            </w:tcBorders>
+            <w:tcMar>
+              <w:top w:type="dxa" w:w="60"/>
+              <w:left w:type="dxa" w:w="100"/>
+              <w:bottom w:type="dxa" w:w="60"/>
+              <w:right w:type="dxa" w:w="100"/>
+            </w:tcMar>
+          </w:tcPr>
+          <w:p>
+            <w:r>
+              <w:rPr>
+                <w:rFonts w:ascii="Times New Roman" w:cs="Times New Roman" w:eastAsia="Microsoft YaHei" w:hAnsi="Times New Roman"/>
+                <w:sz w:val="20"/>
+                <w:szCs w:val="20"/>
+              </w:rPr>
+              <w:t xml:space="preserve">[n]</w:t>
+            </w:r>
+          </w:p>
+        </w:tc>
+        <w:tc>
+          <w:tcPr>
+            <w:tcW w:type="dxa" w:w="2258"/>
+            <w:tcBorders>
+              <w:top w:val="none" w:color="FFFFFF" w:sz="0"/>
+              <w:left w:val="none" w:color="FFFFFF" w:sz="0"/>
+              <w:bottom w:val="none" w:color="FFFFFF" w:sz="0"/>
+              <w:right w:val="none" w:color="FFFFFF" w:sz="0"/>
+            </w:tcBorders>
+            <w:tcMar>
+              <w:top w:type="dxa" w:w="60"/>
+              <w:left w:type="dxa" w:w="100"/>
+              <w:bottom w:type="dxa" w:w="60"/>
+              <w:right w:type="dxa" w:w="100"/>
+            </w:tcMar>
+          </w:tcPr>
+          <w:p>
+            <w:r>
+              <w:rPr>
+                <w:rFonts w:ascii="Times New Roman" w:cs="Times New Roman" w:eastAsia="Microsoft YaHei" w:hAnsi="Times New Roman"/>
+                <w:sz w:val="20"/>
+                <w:szCs w:val="20"/>
+              </w:rPr>
+              <w:t xml:space="preserve">[x (x to x)]</w:t>
+            </w:r>
+          </w:p>
+        </w:tc>
+      </w:tr>
+      <w:tr>
+        <w:trPr>
+          <w:cantSplit/>
+          <w:tblHeader w:val="false"/>
+        </w:trPr>
+        <w:tc>
+          <w:tcPr>
+            <w:tcW w:type="dxa" w:w="2256"/>
+            <w:tcBorders>
+              <w:top w:val="none" w:color="FFFFFF" w:sz="0"/>
+              <w:left w:val="none" w:color="FFFFFF" w:sz="0"/>
+              <w:bottom w:val="none" w:color="FFFFFF" w:sz="0"/>
+              <w:right w:val="none" w:color="FFFFFF" w:sz="0"/>
+            </w:tcBorders>
+            <w:tcMar>
+              <w:top w:type="dxa" w:w="60"/>
+              <w:left w:type="dxa" w:w="100"/>
+              <w:bottom w:type="dxa" w:w="60"/>
+              <w:right w:type="dxa" w:w="100"/>
+            </w:tcMar>
+          </w:tcPr>
+          <w:p>
+            <w:r>
+              <w:rPr>
+                <w:rFonts w:ascii="Times New Roman" w:cs="Times New Roman" w:eastAsia="Microsoft YaHei" w:hAnsi="Times New Roman"/>
+                <w:sz w:val="20"/>
+                <w:szCs w:val="20"/>
+              </w:rPr>
+              <w:t xml:space="preserve">10. Splenectomy with viability not reported assigned as non-viable (added after registration; assumption)</w:t>
+            </w:r>
+          </w:p>
+        </w:tc>
+        <w:tc>
+          <w:tcPr>
+            <w:tcW w:type="dxa" w:w="2256"/>
+            <w:tcBorders>
+              <w:top w:val="none" w:color="FFFFFF" w:sz="0"/>
+              <w:left w:val="none" w:color="FFFFFF" w:sz="0"/>
+              <w:bottom w:val="none" w:color="FFFFFF" w:sz="0"/>
+              <w:right w:val="none" w:color="FFFFFF" w:sz="0"/>
+            </w:tcBorders>
+            <w:tcMar>
+              <w:top w:type="dxa" w:w="60"/>
+              <w:left w:type="dxa" w:w="100"/>
+              <w:bottom w:type="dxa" w:w="60"/>
+              <w:right w:type="dxa" w:w="100"/>
+            </w:tcMar>
+          </w:tcPr>
+          <w:p>
+            <w:r>
+              <w:rPr>
+                <w:rFonts w:ascii="Times New Roman" w:cs="Times New Roman" w:eastAsia="Microsoft YaHei" w:hAnsi="Times New Roman"/>
+                <w:sz w:val="20"/>
+                <w:szCs w:val="20"/>
+              </w:rPr>
+              <w:t xml:space="preserve">[n]</w:t>
+            </w:r>
+          </w:p>
+        </w:tc>
+        <w:tc>
+          <w:tcPr>
+            <w:tcW w:type="dxa" w:w="2256"/>
+            <w:tcBorders>
+              <w:top w:val="none" w:color="FFFFFF" w:sz="0"/>
+              <w:left w:val="none" w:color="FFFFFF" w:sz="0"/>
+              <w:bottom w:val="none" w:color="FFFFFF" w:sz="0"/>
+              <w:right w:val="none" w:color="FFFFFF" w:sz="0"/>
+            </w:tcBorders>
+            <w:tcMar>
+              <w:top w:type="dxa" w:w="60"/>
+              <w:left w:type="dxa" w:w="100"/>
+              <w:bottom w:type="dxa" w:w="60"/>
+              <w:right w:type="dxa" w:w="100"/>
+            </w:tcMar>
+          </w:tcPr>
+          <w:p>
+            <w:r>
+              <w:rPr>
+                <w:rFonts w:ascii="Times New Roman" w:cs="Times New Roman" w:eastAsia="Microsoft YaHei" w:hAnsi="Times New Roman"/>
+                <w:sz w:val="20"/>
+                <w:szCs w:val="20"/>
+              </w:rPr>
+              <w:t xml:space="preserve">[n]</w:t>
+            </w:r>
+          </w:p>
+        </w:tc>
+        <w:tc>
+          <w:tcPr>
+            <w:tcW w:type="dxa" w:w="2258"/>
+            <w:tcBorders>
+              <w:top w:val="none" w:color="FFFFFF" w:sz="0"/>
+              <w:left w:val="none" w:color="FFFFFF" w:sz="0"/>
+              <w:bottom w:val="none" w:color="FFFFFF" w:sz="0"/>
+              <w:right w:val="none" w:color="FFFFFF" w:sz="0"/>
+            </w:tcBorders>
+            <w:tcMar>
+              <w:top w:type="dxa" w:w="60"/>
+              <w:left w:type="dxa" w:w="100"/>
+              <w:bottom w:type="dxa" w:w="60"/>
+              <w:right w:type="dxa" w:w="100"/>
+            </w:tcMar>
+          </w:tcPr>
+          <w:p>
+            <w:r>
+              <w:rPr>
+                <w:rFonts w:ascii="Times New Roman" w:cs="Times New Roman" w:eastAsia="Microsoft YaHei" w:hAnsi="Times New Roman"/>
+                <w:sz w:val="20"/>
+                <w:szCs w:val="20"/>
+              </w:rPr>
+              <w:t xml:space="preserve">[x (x to x)]</w:t>
+            </w:r>
+          </w:p>
+        </w:tc>
+      </w:tr>
+      <w:tr>
+        <w:trPr>
+          <w:cantSplit/>
+          <w:tblHeader w:val="false"/>
+        </w:trPr>
+        <w:tc>
+          <w:tcPr>
+            <w:tcW w:type="dxa" w:w="2256"/>
+            <w:tcBorders>
+              <w:top w:val="none" w:color="FFFFFF" w:sz="0"/>
+              <w:left w:val="none" w:color="FFFFFF" w:sz="0"/>
+              <w:bottom w:val="none" w:color="FFFFFF" w:sz="0"/>
+              <w:right w:val="none" w:color="FFFFFF" w:sz="0"/>
+            </w:tcBorders>
+            <w:tcMar>
+              <w:top w:type="dxa" w:w="60"/>
+              <w:left w:type="dxa" w:w="100"/>
+              <w:bottom w:type="dxa" w:w="60"/>
+              <w:right w:type="dxa" w:w="100"/>
+            </w:tcMar>
+          </w:tcPr>
+          <w:p>
+            <w:r>
+              <w:rPr>
+                <w:rFonts w:ascii="Times New Roman" w:cs="Times New Roman" w:eastAsia="Microsoft YaHei" w:hAnsi="Times New Roman"/>
+                <w:sz w:val="20"/>
+                <w:szCs w:val="20"/>
+              </w:rPr>
+              <w:t xml:space="preserve">11. Splenectomy with viability not reported assigned as viable (added after registration)</w:t>
+            </w:r>
+          </w:p>
+        </w:tc>
+        <w:tc>
+          <w:tcPr>
+            <w:tcW w:type="dxa" w:w="2256"/>
+            <w:tcBorders>
+              <w:top w:val="none" w:color="FFFFFF" w:sz="0"/>
+              <w:left w:val="none" w:color="FFFFFF" w:sz="0"/>
+              <w:bottom w:val="none" w:color="FFFFFF" w:sz="0"/>
+              <w:right w:val="none" w:color="FFFFFF" w:sz="0"/>
+            </w:tcBorders>
+            <w:tcMar>
+              <w:top w:type="dxa" w:w="60"/>
+              <w:left w:type="dxa" w:w="100"/>
+              <w:bottom w:type="dxa" w:w="60"/>
+              <w:right w:type="dxa" w:w="100"/>
+            </w:tcMar>
+          </w:tcPr>
+          <w:p>
+            <w:r>
+              <w:rPr>
+                <w:rFonts w:ascii="Times New Roman" w:cs="Times New Roman" w:eastAsia="Microsoft YaHei" w:hAnsi="Times New Roman"/>
+                <w:sz w:val="20"/>
+                <w:szCs w:val="20"/>
+              </w:rPr>
+              <w:t xml:space="preserve">[n]</w:t>
+            </w:r>
+          </w:p>
+        </w:tc>
+        <w:tc>
+          <w:tcPr>
+            <w:tcW w:type="dxa" w:w="2256"/>
+            <w:tcBorders>
+              <w:top w:val="none" w:color="FFFFFF" w:sz="0"/>
+              <w:left w:val="none" w:color="FFFFFF" w:sz="0"/>
+              <w:bottom w:val="none" w:color="FFFFFF" w:sz="0"/>
+              <w:right w:val="none" w:color="FFFFFF" w:sz="0"/>
+            </w:tcBorders>
+            <w:tcMar>
+              <w:top w:type="dxa" w:w="60"/>
+              <w:left w:type="dxa" w:w="100"/>
+              <w:bottom w:type="dxa" w:w="60"/>
+              <w:right w:type="dxa" w:w="100"/>
+            </w:tcMar>
+          </w:tcPr>
+          <w:p>
+            <w:r>
+              <w:rPr>
+                <w:rFonts w:ascii="Times New Roman" w:cs="Times New Roman" w:eastAsia="Microsoft YaHei" w:hAnsi="Times New Roman"/>
+                <w:sz w:val="20"/>
+                <w:szCs w:val="20"/>
+              </w:rPr>
+              <w:t xml:space="preserve">[n]</w:t>
+            </w:r>
+          </w:p>
+        </w:tc>
+        <w:tc>
+          <w:tcPr>
+            <w:tcW w:type="dxa" w:w="2258"/>
+            <w:tcBorders>
+              <w:top w:val="none" w:color="FFFFFF" w:sz="0"/>
+              <w:left w:val="none" w:color="FFFFFF" w:sz="0"/>
+              <w:bottom w:val="none" w:color="FFFFFF" w:sz="0"/>
+              <w:right w:val="none" w:color="FFFFFF" w:sz="0"/>
+            </w:tcBorders>
+            <w:tcMar>
+              <w:top w:type="dxa" w:w="60"/>
+              <w:left w:type="dxa" w:w="100"/>
+              <w:bottom w:type="dxa" w:w="60"/>
+              <w:right w:type="dxa" w:w="100"/>
+            </w:tcMar>
+          </w:tcPr>
+          <w:p>
+            <w:r>
+              <w:rPr>
+                <w:rFonts w:ascii="Times New Roman" w:cs="Times New Roman" w:eastAsia="Microsoft YaHei" w:hAnsi="Times New Roman"/>
+                <w:sz w:val="20"/>
+                <w:szCs w:val="20"/>
+              </w:rPr>
+              <w:t xml:space="preserve">[x (x to x)]</w:t>
+            </w:r>
+          </w:p>
+        </w:tc>
+      </w:tr>
+      <w:tr>
+        <w:trPr>
+          <w:cantSplit/>
+          <w:tblHeader w:val="false"/>
+        </w:trPr>
+        <w:tc>
+          <w:tcPr>
+            <w:tcW w:type="dxa" w:w="2256"/>
+            <w:tcBorders>
+              <w:top w:val="none" w:color="FFFFFF" w:sz="0"/>
+              <w:left w:val="none" w:color="FFFFFF" w:sz="0"/>
+              <w:bottom w:val="none" w:color="FFFFFF" w:sz="0"/>
+              <w:right w:val="none" w:color="FFFFFF" w:sz="0"/>
+            </w:tcBorders>
+            <w:tcMar>
+              <w:top w:type="dxa" w:w="60"/>
+              <w:left w:type="dxa" w:w="100"/>
+              <w:bottom w:type="dxa" w:w="60"/>
+              <w:right w:type="dxa" w:w="100"/>
+            </w:tcMar>
+          </w:tcPr>
+          <w:p>
+            <w:r>
+              <w:rPr>
+                <w:rFonts w:ascii="Times New Roman" w:cs="Times New Roman" w:eastAsia="Microsoft YaHei" w:hAnsi="Times New Roman"/>
+                <w:sz w:val="20"/>
+                <w:szCs w:val="20"/>
+              </w:rPr>
+              <w:t xml:space="preserve">12. Without children whose duration is a lower bound (added after registration)</w:t>
+            </w:r>
+          </w:p>
+        </w:tc>
+        <w:tc>
+          <w:tcPr>
+            <w:tcW w:type="dxa" w:w="2256"/>
+            <w:tcBorders>
+              <w:top w:val="none" w:color="FFFFFF" w:sz="0"/>
+              <w:left w:val="none" w:color="FFFFFF" w:sz="0"/>
+              <w:bottom w:val="none" w:color="FFFFFF" w:sz="0"/>
+              <w:right w:val="none" w:color="FFFFFF" w:sz="0"/>
+            </w:tcBorders>
+            <w:tcMar>
+              <w:top w:type="dxa" w:w="60"/>
+              <w:left w:type="dxa" w:w="100"/>
+              <w:bottom w:type="dxa" w:w="60"/>
+              <w:right w:type="dxa" w:w="100"/>
+            </w:tcMar>
+          </w:tcPr>
+          <w:p>
+            <w:r>
+              <w:rPr>
+                <w:rFonts w:ascii="Times New Roman" w:cs="Times New Roman" w:eastAsia="Microsoft YaHei" w:hAnsi="Times New Roman"/>
+                <w:sz w:val="20"/>
+                <w:szCs w:val="20"/>
+              </w:rPr>
+              <w:t xml:space="preserve">[n]</w:t>
+            </w:r>
+          </w:p>
+        </w:tc>
+        <w:tc>
+          <w:tcPr>
+            <w:tcW w:type="dxa" w:w="2256"/>
+            <w:tcBorders>
+              <w:top w:val="none" w:color="FFFFFF" w:sz="0"/>
+              <w:left w:val="none" w:color="FFFFFF" w:sz="0"/>
+              <w:bottom w:val="none" w:color="FFFFFF" w:sz="0"/>
+              <w:right w:val="none" w:color="FFFFFF" w:sz="0"/>
+            </w:tcBorders>
+            <w:tcMar>
+              <w:top w:type="dxa" w:w="60"/>
+              <w:left w:type="dxa" w:w="100"/>
+              <w:bottom w:type="dxa" w:w="60"/>
+              <w:right w:type="dxa" w:w="100"/>
+            </w:tcMar>
+          </w:tcPr>
+          <w:p>
+            <w:r>
+              <w:rPr>
+                <w:rFonts w:ascii="Times New Roman" w:cs="Times New Roman" w:eastAsia="Microsoft YaHei" w:hAnsi="Times New Roman"/>
+                <w:sz w:val="20"/>
+                <w:szCs w:val="20"/>
+              </w:rPr>
+              <w:t xml:space="preserve">[n]</w:t>
+            </w:r>
+          </w:p>
+        </w:tc>
+        <w:tc>
+          <w:tcPr>
+            <w:tcW w:type="dxa" w:w="2258"/>
+            <w:tcBorders>
+              <w:top w:val="none" w:color="FFFFFF" w:sz="0"/>
+              <w:left w:val="none" w:color="FFFFFF" w:sz="0"/>
+              <w:bottom w:val="none" w:color="FFFFFF" w:sz="0"/>
+              <w:right w:val="none" w:color="FFFFFF" w:sz="0"/>
+            </w:tcBorders>
+            <w:tcMar>
+              <w:top w:type="dxa" w:w="60"/>
+              <w:left w:type="dxa" w:w="100"/>
+              <w:bottom w:type="dxa" w:w="60"/>
+              <w:right w:type="dxa" w:w="100"/>
+            </w:tcMar>
+          </w:tcPr>
+          <w:p>
+            <w:r>
+              <w:rPr>
+                <w:rFonts w:ascii="Times New Roman" w:cs="Times New Roman" w:eastAsia="Microsoft YaHei" w:hAnsi="Times New Roman"/>
+                <w:sz w:val="20"/>
+                <w:szCs w:val="20"/>
+              </w:rPr>
+              <w:t xml:space="preserve">[x (x to x)]</w:t>
+            </w:r>
+          </w:p>
+        </w:tc>
+      </w:tr>
+      <w:tr>
+        <w:trPr>
+          <w:cantSplit/>
+          <w:tblHeader w:val="false"/>
+        </w:trPr>
+        <w:tc>
+          <w:tcPr>
+            <w:tcW w:type="dxa" w:w="2256"/>
+            <w:tcBorders>
+              <w:top w:val="none" w:color="FFFFFF" w:sz="0"/>
+              <w:left w:val="none" w:color="FFFFFF" w:sz="0"/>
               <w:bottom w:val="single" w:color="000000" w:sz="8"/>
               <w:right w:val="none" w:color="FFFFFF" w:sz="0"/>
             </w:tcBorders>
@@ -9116,7 +9728,7 @@
                 <w:sz w:val="20"/>
                 <w:szCs w:val="20"/>
               </w:rPr>
-              <w:t xml:space="preserve">9. Without children included on the basis of pedicle torsion alone (added after registration)</w:t>
+              <w:t xml:space="preserve">13. Without the report that states an overlap with another report (added after registration)</w:t>
             </w:r>
           </w:p>
         </w:tc>
@@ -9216,7 +9828,7 @@
         <w:rPr>
           <w:rFonts w:ascii="Times New Roman" w:cs="Times New Roman" w:eastAsia="Microsoft YaHei" w:hAnsi="Times New Roman"/>
         </w:rPr>
-        <w:t xml:space="preserve">Footnote. All models were adjusted for age and period of publication. Analysis 9 was not registered.</w:t>
+        <w:t xml:space="preserve">Footnote. All models were adjusted for age and period of publication. Analyses 9 to 13 were not registered; analysis 10 rests on an assumption, not on an observation.</w:t>
       </w:r>
     </w:p>
     <w:p>
@@ -9618,7 +10230,7 @@
         <w:rPr>
           <w:rFonts w:ascii="Times New Roman" w:cs="Times New Roman" w:eastAsia="Microsoft YaHei" w:hAnsi="Times New Roman"/>
         </w:rPr>
-        <w:t xml:space="preserve"> Evidence from case reports and small series is expected to be of very low certainty, with selective reporting of successful salvage and of favourable timelines. Embase and Google Scholar were not searched and citation searching was incomplete, so relevant reports may have been missed. Reports in languages other than English and Chinese were listed but not extracted, and reports published before 2000 were not sought, so cases described in earlier decades, including possible long histories, are not represented. The duration of symptoms is reported inconsistently and may be missing for children whose spleen was saved. Our own series is small and single-centre and includes only children who came to operation. One of the two extractors (JS) took part in the pilot extraction from which the primary exposure was derived, so the extraction was not blind to the hypothesis; the pilot table was not consulted during the formal extraction </w:t>
+        <w:t xml:space="preserve"> Evidence from case reports and small series is expected to be of very low certainty, with selective reporting of successful salvage and of favourable timelines. Embase and Google Scholar were not searched and citation searching was incomplete, so relevant reports may have been missed. Reports in languages other than English and Chinese were listed but not extracted, and reports published before 2000 were not sought, so cases described in earlier decades, including possible long histories, are not represented. The duration of symptoms is reported inconsistently and may be missing for children whose spleen was saved. Splenic viability was recorded only where the authors described the spleen, so children with a splenectomy and no description are outside the primary analysis; the bounding analyses show how far this could change the result but cannot remove the bias. Some durations are lower bounds, and a report that overlaps with another could not be matched child by child, so a few children may be counted twice. Our own series is small and single-centre and includes only children who came to operation. One of the two extractors (JS) took part in the pilot extraction from which the primary exposure was derived, so the extraction was not blind to the hypothesis; the pilot table was not consulted during the formal extraction </w:t>
       </w:r>
       <w:r>
         <w:rPr>
@@ -10385,7 +10997,7 @@
         <w:sz w:val="18"/>
         <w:szCs w:val="18"/>
       </w:rPr>
-      <w:t xml:space="preserve">Manuscript draft v0.2 (19 Oct 2026) - not for submission   |   Page </w:t>
+      <w:t xml:space="preserve">Manuscript draft v0.2 (25 Oct 2026) - not for submission   |   Page </w:t>
     </w:r>
     <w:r>
       <w:rPr>

</xml_diff>

<commit_message>
Protocol v1.8: cluster and period of the own series, continuous duration categories, duplicate-report rule; manuscript aligned
Co-Authored-By: Claude Sonnet 5.5 <noreply@anthropic.com>
Claude-Session: https://claude.ai/code/session_01FRD7etKqYN8v2bbXeeLMRW
</commit_message>
<xml_diff>
--- a/Manuscript draft - systematic review with IPD (v0.2).docx
+++ b/Manuscript draft - systematic review with IPD (v0.2).docx
@@ -403,15 +403,15 @@
         <w:rPr>
           <w:rFonts w:ascii="Times New Roman" w:cs="Times New Roman" w:eastAsia="Microsoft YaHei" w:hAnsi="Times New Roman"/>
         </w:rPr>
-        <w:t xml:space="preserve">The protocol was registered in PROSPERO on 28 September 2026 (CRD420261520329). The protocol document was then revised in versions 1.1 to 1.7: version 1.1 revised the search strategies after review by a medical librarian, before any formal search was run; version 1.2 added the as-run details of the searches and the deviations listed below; versions 1.3 and 1.4 added the screening procedure and the stage of the review; version 1.5 describes how the title and abstract stage was carried out and sets out the full-text procedure; version 1.6 drops the log of working times for the full-text stage; version 1.7 specifies how splenic viability is recorded and how a missing outcome, durations that are only lower bounds and possible duplicate patients are handled in the analysis. Eligibility criteria, exposures, outcomes and the analysis plan were not changed in versions 1.1 to 1.4 or in version 1.6. Version 1.5 changed them only in the respects listed under Deviations from the protocol: reports published before 2000 are not sought, which empties one level of the period-of-publication covariate and makes one registered sensitivity analysis inapplicable, and one analysis that was not registered was added. Version 1.7 added a rule for recording splenic viability and three further analyses that were not registered; it was dated 25 October 2026, after the extraction form had been calibrated on 10 reports and before the formal extraction began, and before any analysis of duration and outcome. The review question, the primary exposure and the primary outcome are unchanged. The PROSPERO record was amended once, on 18 October 2026 (record version 2.0, published at 15:20 UTC after approval by the review team); it reports the searches as run, the screening procedure as carried out and the changes listed under Deviations from the protocol. The protocol file attached to the record is version 1.5 and is publicly available through the record. </w:t>
-      </w:r>
-      <w:r>
-        <w:rPr>
-          <w:rFonts w:ascii="Times New Roman" w:cs="Times New Roman" w:eastAsia="Microsoft YaHei" w:hAnsi="Times New Roman"/>
-          <w:b/>
-          <w:bCs/>
-        </w:rPr>
-        <w:t xml:space="preserve">[PENDING: versions 1.6 (19 October 2026), which only drops the log of working times, and 1.7 (25 October 2026) are not attached to the record, and the registered text of the data synthesis does not contain the version 1.7 analyses (a change to that field needs a major revision approved by all authors). The authors to decide whether to replace the file (according to the record page as read on 18 October 2026, the protocol file can be changed without the approval of the other authors) or to rely on the Deviations section; either way the Deviations section must say which version is attached.]</w:t>
+        <w:t xml:space="preserve">The protocol was registered in PROSPERO on 28 September 2026 (CRD420261520329). The protocol document was then revised in versions 1.1 to 1.8: version 1.1 revised the search strategies after review by a medical librarian, before any formal search was run; version 1.2 added the as-run details of the searches and the deviations listed below; versions 1.3 and 1.4 added the screening procedure and the stage of the review; version 1.5 describes how the title and abstract stage was carried out and sets out the full-text procedure; version 1.6 drops the log of working times for the full-text stage; version 1.7 specifies how splenic viability is recorded and how a missing outcome, durations that are only lower bounds and possible duplicate patients are handled in the analysis; version 1.8 fixes three analysis details (clustering and period of the institutional series, assignment of durations that are not whole days, and the report omitted in the duplicate-patient analysis). Eligibility criteria, exposures, outcomes and the analysis plan were not changed in versions 1.1 to 1.4 or in version 1.6. Version 1.5 changed them only in the respects listed under Deviations from the protocol: reports published before 2000 are not sought, which empties one level of the period-of-publication covariate and makes one registered sensitivity analysis inapplicable, and one analysis that was not registered was added. Version 1.7 added a rule for recording splenic viability and three further analyses that were not registered; it was dated 25 October 2026, after the extraction form had been calibrated on 10 reports and before the formal extraction began, and before any analysis of duration and outcome. The review question, the primary exposure and the primary outcome are unchanged. The PROSPERO record was amended once, on 18 October 2026 (record version 2.0, published at 15:20 UTC after approval by the review team); it reports the searches as run, the screening procedure as carried out and the changes listed under Deviations from the protocol. The protocol file attached to the record is version 1.5 and is publicly available through the record. </w:t>
+      </w:r>
+      <w:r>
+        <w:rPr>
+          <w:rFonts w:ascii="Times New Roman" w:cs="Times New Roman" w:eastAsia="Microsoft YaHei" w:hAnsi="Times New Roman"/>
+          <w:b/>
+          <w:bCs/>
+        </w:rPr>
+        <w:t xml:space="preserve">[PENDING: versions 1.6 (19 October 2026), which only drops the log of working times, and 1.7 and 1.8 (both 25 October 2026) are not attached to the record, and the registered text of the data synthesis does not contain the version 1.7 analyses (a change to that field needs a major revision approved by all authors). The authors to decide whether to replace the file (according to the record page as read on 18 October 2026, the protocol file can be changed without the approval of the other authors) or to rely on the Deviations section; either way the Deviations section must say which version is attached.]</w:t>
       </w:r>
       <w:r>
         <w:rPr>
@@ -1686,21 +1686,7 @@
         <w:rPr>
           <w:rFonts w:ascii="Times New Roman" w:cs="Times New Roman" w:eastAsia="Microsoft YaHei" w:hAnsi="Times New Roman"/>
         </w:rPr>
-        <w:t xml:space="preserve">We summarised the characteristics of all included patients with counts and percentages or medians and ranges. The primary analysis was a one-stage logistic regression of a non-viable spleen on log2-transformed index-episode duration, with cluster-robust standard errors by report, adjusted for age (years) and period of publication (2000–2014, 2015 onward; the registered covariate had a third level, before 2000, which is empty because such reports were not sought) </w:t>
-      </w:r>
-      <w:r>
-        <w:rPr>
-          <w:rFonts w:ascii="Times New Roman" w:cs="Times New Roman" w:eastAsia="Microsoft YaHei" w:hAnsi="Times New Roman"/>
-          <w:b/>
-          <w:bCs/>
-        </w:rPr>
-        <w:t xml:space="preserve">[PENDING: confirm the change with the statistician]</w:t>
-      </w:r>
-      <w:r>
-        <w:rPr>
-          <w:rFonts w:ascii="Times New Roman" w:cs="Times New Roman" w:eastAsia="Microsoft YaHei" w:hAnsi="Times New Roman"/>
-        </w:rPr>
-        <w:t xml:space="preserve">; the effect was expressed as an odds ratio per doubling of duration. Degree of torsion and infarction lie on the causal pathway and were not adjusted for. If there were at least 10 events per model degree of freedom, non-linearity was to be examined with a restricted cubic spline with three knots. Secondary analyses used four duration categories (2 days or less, 3–7, 8–30, more than 30 days) with exact 95% confidence intervals and a test for trend, the same model for total symptom history and the binary exposures, and exact confidence intervals for the proportion of children who developed torsion while awaiting surgery.</w:t>
+        <w:t xml:space="preserve">We summarised the characteristics of all included patients with counts and percentages or medians and ranges. The primary analysis was a one-stage logistic regression of a non-viable spleen on log2-transformed index-episode duration, with cluster-robust standard errors by report, adjusted for age (years) and period of publication (2000–2014, 2015 onward; the registered covariate had a third level, before 2000, which is empty because such reports were not sought; our own series is one cluster and belongs to the period 2015 onward); the effect was expressed as an odds ratio per doubling of duration. Degree of torsion and infarction lie on the causal pathway and were not adjusted for. If there were at least 10 events per model degree of freedom, non-linearity was to be examined with a restricted cubic spline with three knots. Secondary analyses used four duration categories (2 days or less, more than 2 to 7, more than 7 to 30, more than 30 days; durations that are not whole days were assigned by these intervals, the upper limit being included) with exact 95% confidence intervals and a test for trend, the same model for total symptom history and the binary exposures, and exact confidence intervals for the proportion of children who developed torsion while awaiting surgery.</w:t>
       </w:r>
     </w:p>
     <w:p>
@@ -1711,21 +1697,7 @@
         <w:rPr>
           <w:rFonts w:ascii="Times New Roman" w:cs="Times New Roman" w:eastAsia="Microsoft YaHei" w:hAnsi="Times New Roman"/>
         </w:rPr>
-        <w:t xml:space="preserve">Missing durations were handled by complete-case analysis, a comparison of patients with and without a reported duration, and bounding analyses that assigned all missing durations first to the shortest and then to the longest category; multiple imputation was not used because duration is unlikely to be missing at random. Children whose splenic viability was not reported were not in the primary analysis; their number and the operations they had are reported. Pre-specified subgroups were presentation with gastric volvulus or gastric outlet obstruction, congenital versus acquired wandering spleen, and an associated diaphragmatic anomaly. Pre-specified sensitivity analyses excluded our own five patients, restricted the analysis to pedicle torsion confirmed at operation, coded partial splenectomy for partial infarction as salvage, used alternative coding of intermittent or worsening episodes, restricted the analysis to reports judged adequate, excluded Chinese-language reports, and used mixed-effects logistic regression with a random intercept for each report; the registered analysis that excluded reports published before 2000 does not apply, because such reports were not sought. Four analyses that were not registered were added. The first, in version 1.5, omitted children who were included on the basis of splenic pedicle torsion alone, without a stated position of the spleen. The other three were added in version 1.7, before the formal extraction began: (a) children who had a splenectomy and whose viability was not reported were assigned first all to non-viable and then all to viable, because viability may be omitted more often in children whose spleen was removed; the assignment to non-viable is an assumption, not an observation; (b) children whose index-episode duration was only a lower bound, that is, the report gave the duration up to consultation or admission but not the time to operation (rule 9), were omitted; and (c) where a report stated that some of its patients had been reported before without saying which, the report that stated the overlap was omitted, because the overlapping children could not be identified and cluster-robust standard errors do not remove duplicated patients. </w:t>
-      </w:r>
-      <w:r>
-        <w:rPr>
-          <w:rFonts w:ascii="Times New Roman" w:cs="Times New Roman" w:eastAsia="Microsoft YaHei" w:hAnsi="Times New Roman"/>
-          <w:b/>
-          <w:bCs/>
-        </w:rPr>
-        <w:t xml:space="preserve">[PENDING: confirm with the statistician the added analyses and, for (c), which of the two reports is omitted; how our own five children are clustered and which period they take; how durations that are not whole days are assigned to the four categories.]</w:t>
-      </w:r>
-      <w:r>
-        <w:rPr>
-          <w:rFonts w:ascii="Times New Roman" w:cs="Times New Roman" w:eastAsia="Microsoft YaHei" w:hAnsi="Times New Roman"/>
-        </w:rPr>
-        <w:t xml:space="preserve"> Certainty of evidence was to be described with GRADE principles. Analyses were to be done in R </w:t>
+        <w:t xml:space="preserve">Missing durations were handled by complete-case analysis, a comparison of patients with and without a reported duration, and bounding analyses that assigned all missing durations first to the shortest and then to the longest category; multiple imputation was not used because duration is unlikely to be missing at random. Children whose splenic viability was not reported were not in the primary analysis; their number and the operations they had are reported. Pre-specified subgroups were presentation with gastric volvulus or gastric outlet obstruction, congenital versus acquired wandering spleen, and an associated diaphragmatic anomaly. Pre-specified sensitivity analyses excluded our own five patients, restricted the analysis to pedicle torsion confirmed at operation, coded partial splenectomy for partial infarction as salvage, used alternative coding of intermittent or worsening episodes, restricted the analysis to reports judged adequate, excluded Chinese-language reports, and used mixed-effects logistic regression with a random intercept for each report; the registered analysis that excluded reports published before 2000 does not apply, because such reports were not sought. Four analyses that were not registered were added. The first, in version 1.5, omitted children who were included on the basis of splenic pedicle torsion alone, without a stated position of the spleen. The other three were added in version 1.7, before the formal extraction began: (a) children who had a splenectomy and whose viability was not reported were assigned first all to non-viable and then all to viable, because viability may be omitted more often in children whose spleen was removed; the assignment to non-viable is an assumption, not an observation; (b) children whose index-episode duration was only a lower bound, that is, the report gave the duration up to consultation or admission but not the time to operation (rule 9), were omitted; and (c) where a report stated that some of its patients had been reported before without saying which, the report that stated the overlap (the later report) was omitted, because the overlapping children could not be identified and cluster-robust standard errors do not remove duplicated patients. The added analyses and these details were agreed with the statistician before the formal extraction began. Certainty of evidence was to be described with GRADE principles. Analyses were to be done in R </w:t>
       </w:r>
       <w:r>
         <w:rPr>
@@ -7213,7 +7185,7 @@
                 <w:sz w:val="20"/>
                 <w:szCs w:val="20"/>
               </w:rPr>
-              <w:t xml:space="preserve">3 to 7 days</w:t>
+              <w:t xml:space="preserve">More than 2 to 7 days</w:t>
             </w:r>
           </w:p>
         </w:tc>
@@ -7327,7 +7299,7 @@
                 <w:sz w:val="20"/>
                 <w:szCs w:val="20"/>
               </w:rPr>
-              <w:t xml:space="preserve">8 to 30 days</w:t>
+              <w:t xml:space="preserve">More than 7 to 30 days</w:t>
             </w:r>
           </w:p>
         </w:tc>
@@ -7655,7 +7627,7 @@
         <w:rPr>
           <w:rFonts w:ascii="Times New Roman" w:cs="Times New Roman" w:eastAsia="Microsoft YaHei" w:hAnsi="Times New Roman"/>
         </w:rPr>
-        <w:t xml:space="preserve">Footnote. Boundary values fall in the lower category. Durations coded as lower bounds are flagged in the child-level dataset in the repository (see Availability of data and materials).</w:t>
+        <w:t xml:space="preserve">Footnote. Durations that are not whole days are assigned by these intervals; the upper limit is included in the category. Durations coded as lower bounds are flagged in the child-level dataset in the repository (see Availability of data and materials).</w:t>
       </w:r>
     </w:p>
     <w:p>

</xml_diff>